<commit_message>
Update CA download to the revised Cascades at The Colony Portfolio agreement
</commit_message>
<xml_diff>
--- a/assets/docs/Cascades-The-Colony-Portfolio-CA.docx
+++ b/assets/docs/Cascades-The-Colony-Portfolio-CA.docx
@@ -34,71 +34,78 @@
         <w:spacing w:after="80"/>
         <w:jc w:val="both"/>
         <w:rPr>
+          <w:rFonts w:ascii="Times New Roman" w:hAnsi="Times New Roman"/>
+        </w:rPr>
+      </w:pPr>
+      <w:r>
+        <w:rPr>
+          <w:rFonts w:ascii="Times New Roman" w:hAnsi="Times New Roman"/>
+        </w:rPr>
+        <w:t xml:space="preserve">This confidentiality agreement (the “Agreement”) will confirm the mutual understandings of </w:t>
+      </w:r>
+      <w:r>
+        <w:t xml:space="preserve">Jackson-Shaw/Stone Creek Hotel LP, Jackson-Shaw/Stone Creek Hotel 2 LP, Jackson-Shaw/Stone Creek Hotel 3 LP </w:t>
+      </w:r>
+      <w:r>
+        <w:rPr>
+          <w:rFonts w:ascii="Times New Roman" w:hAnsi="Times New Roman"/>
+        </w:rPr>
+        <w:t xml:space="preserve">and its representatives and advisors (collectively the “Company”) and the recipient identified below (the “Recipient”) in connection with Company’s providing confidential and proprietary information to the Recipient regarding </w:t>
+      </w:r>
+      <w:r>
+        <w:rPr>
+          <w:sz w:val="23"/>
+          <w:szCs w:val="23"/>
+        </w:rPr>
+        <w:t>the following properties</w:t>
+      </w:r>
+      <w:r>
+        <w:rPr>
+          <w:b/>
+          <w:bCs/>
+          <w:sz w:val="23"/>
+          <w:szCs w:val="23"/>
+        </w:rPr>
+        <w:t xml:space="preserve"> </w:t>
+      </w:r>
+      <w:r>
+        <w:rPr>
           <w:snapToGrid w:val="0"/>
           <w:color w:val="000000"/>
         </w:rPr>
-      </w:pPr>
-      <w:r>
-        <w:rPr>
-          <w:rFonts w:ascii="Times New Roman" w:hAnsi="Times New Roman"/>
-        </w:rPr>
-        <w:t xml:space="preserve">This confidentiality agreement (the “Agreement”) will confirm the mutual understandings of </w:t>
-      </w:r>
-      <w:r>
-        <w:rPr/>
-        <w:t xml:space="preserve">Jackson-Shaw/Stone Creek Hotel LP, Jackson-Shaw/Stone Creek Hotel 2 LP, </w:t>
-      </w:r>
-      <w:r>
-        <w:rPr/>
-        <w:t>Jackson-Shaw/Stone Creek Hotel 3 LP</w:t>
-      </w:r>
-      <w:r>
-        <w:rPr/>
+        <w:t>located in</w:t>
+      </w:r>
+      <w:r>
+        <w:rPr>
+          <w:snapToGrid w:val="0"/>
+          <w:color w:val="000000"/>
+        </w:rPr>
+        <w:t xml:space="preserve"> The Colony</w:t>
+      </w:r>
+      <w:r>
+        <w:rPr>
+          <w:snapToGrid w:val="0"/>
+          <w:color w:val="000000"/>
+        </w:rPr>
+        <w:t>, Texas</w:t>
+      </w:r>
+      <w:r>
+        <w:rPr>
+          <w:snapToGrid w:val="0"/>
+          <w:color w:val="000000"/>
+        </w:rPr>
         <w:t xml:space="preserve"> </w:t>
       </w:r>
       <w:r>
         <w:rPr>
           <w:rFonts w:ascii="Times New Roman" w:hAnsi="Times New Roman"/>
         </w:rPr>
-        <w:t xml:space="preserve">and its representatives and advisors (collectively the “Company”) and the recipient identified below (the “Recipient”) in connection with Company’s providing confidential and proprietary information to the Recipient regarding </w:t>
-      </w:r>
-      <w:r>
-        <w:rPr>
-          <w:sz w:val="23"/>
-          <w:szCs w:val="23"/>
-        </w:rPr>
-        <w:t>the following properties</w:t>
-      </w:r>
-      <w:r>
-        <w:rPr>
-          <w:b w:val="1"/>
-          <w:bCs w:val="1"/>
-          <w:sz w:val="23"/>
-          <w:szCs w:val="23"/>
-        </w:rPr>
-        <w:t xml:space="preserve"> </w:t>
-      </w:r>
-      <w:r>
-        <w:rPr>
-          <w:color w:val="000000" w:themeColor="text1" w:themeTint="FF" w:themeShade="FF"/>
-        </w:rPr>
-        <w:t>located in</w:t>
-      </w:r>
-      <w:r>
-        <w:rPr>
-          <w:color w:val="000000" w:themeColor="text1" w:themeTint="FF" w:themeShade="FF"/>
-        </w:rPr>
-        <w:t xml:space="preserve"> The Colony</w:t>
-      </w:r>
-      <w:r>
-        <w:rPr>
-          <w:color w:val="000000" w:themeColor="text1" w:themeTint="FF" w:themeShade="FF"/>
-        </w:rPr>
-        <w:t>, Texas</w:t>
-      </w:r>
-      <w:r>
-        <w:rPr>
-          <w:color w:val="000000" w:themeColor="text1" w:themeTint="FF" w:themeShade="FF"/>
+        <w:t>(collectively the “Portfolio”)</w:t>
+      </w:r>
+      <w:r>
+        <w:rPr>
+          <w:snapToGrid w:val="0"/>
+          <w:color w:val="000000"/>
         </w:rPr>
         <w:t>:</w:t>
       </w:r>
@@ -175,22 +182,6 @@
     <w:p>
       <w:pPr>
         <w:spacing w:after="80"/>
-        <w:ind w:firstLine="360"/>
-        <w:jc w:val="both"/>
-        <w:rPr>
-          <w:rFonts w:ascii="Times New Roman" w:hAnsi="Times New Roman"/>
-        </w:rPr>
-      </w:pPr>
-      <w:r>
-        <w:rPr>
-          <w:rFonts w:ascii="Times New Roman" w:hAnsi="Times New Roman"/>
-        </w:rPr>
-        <w:t>(collectively the “Portfolio”).</w:t>
-      </w:r>
-    </w:p>
-    <w:p>
-      <w:pPr>
-        <w:spacing w:after="80"/>
         <w:jc w:val="both"/>
         <w:rPr>
           <w:rFonts w:ascii="Times New Roman" w:hAnsi="Times New Roman"/>
@@ -506,13 +497,7 @@
         <w:rPr>
           <w:rFonts w:ascii="Times New Roman" w:hAnsi="Times New Roman"/>
         </w:rPr>
-        <w:t xml:space="preserve">Notwithstanding anything to the contrary, the obligations of confidentiality shall not apply to the tax treatment and tax structure of the proposed transaction and all materials of any kind (including opinions or other tax analyses); provided however, that such disclosure may not include the name or identity of any party, or any information that must be kept </w:t>
-      </w:r>
-      <w:r>
-        <w:rPr>
-          <w:rFonts w:ascii="Times New Roman" w:hAnsi="Times New Roman"/>
-        </w:rPr>
-        <w:t xml:space="preserve">confidential to comply with any applicable securities laws, or until the earlier of the date of public announcement or execution of definitive binding transaction documents.  </w:t>
+        <w:t xml:space="preserve">Notwithstanding anything to the contrary, the obligations of confidentiality shall not apply to the tax treatment and tax structure of the proposed transaction and all materials of any kind (including opinions or other tax analyses); provided however, that such disclosure may not include the name or identity of any party, or any information that must be kept confidential to comply with any applicable securities laws, or until the earlier of the date of public announcement or execution of definitive binding transaction documents.  </w:t>
       </w:r>
     </w:p>
     <w:p>
@@ -532,6 +517,7 @@
           <w:rFonts w:ascii="Times New Roman" w:hAnsi="Times New Roman"/>
           <w:b/>
         </w:rPr>
+        <w:lastRenderedPageBreak/>
         <w:t>Limited Use:</w:t>
       </w:r>
       <w:r>
@@ -698,64 +684,15 @@
       <w:r>
         <w:rPr>
           <w:rFonts w:ascii="Times New Roman" w:hAnsi="Times New Roman"/>
-          <w:b w:val="1"/>
-          <w:bCs w:val="1"/>
-        </w:rPr>
-        <w:t>Not a Contract</w:t>
-      </w:r>
-      <w:r>
-        <w:rPr>
-          <w:rFonts w:ascii="Times New Roman" w:hAnsi="Times New Roman"/>
-          <w:b w:val="1"/>
-          <w:bCs w:val="1"/>
-        </w:rPr>
-        <w:t xml:space="preserve">: </w:t>
-      </w:r>
-      <w:r>
-        <w:rPr>
-          <w:rFonts w:ascii="Times New Roman" w:hAnsi="Times New Roman"/>
-          <w:b w:val="0"/>
-          <w:bCs w:val="0"/>
-        </w:rPr>
-        <w:t>Both</w:t>
-      </w:r>
-      <w:r>
-        <w:rPr>
-          <w:rFonts w:ascii="Times New Roman" w:hAnsi="Times New Roman"/>
-          <w:b w:val="0"/>
-          <w:bCs w:val="0"/>
-        </w:rPr>
-        <w:t xml:space="preserve"> </w:t>
-      </w:r>
-      <w:r>
-        <w:rPr>
-          <w:rFonts w:ascii="Times New Roman" w:hAnsi="Times New Roman"/>
-        </w:rPr>
-        <w:t xml:space="preserve">parties reserve the right to </w:t>
-      </w:r>
-      <w:r>
-        <w:rPr>
-          <w:rFonts w:ascii="Times New Roman" w:hAnsi="Times New Roman"/>
-        </w:rPr>
-        <w:t>terminate</w:t>
-      </w:r>
-      <w:r>
-        <w:rPr>
-          <w:rFonts w:ascii="Times New Roman" w:hAnsi="Times New Roman"/>
-        </w:rPr>
-        <w:t xml:space="preserve"> negotiations and reject any proposal for any reason, prior to execution of definitive transaction documents</w:t>
-      </w:r>
-      <w:r>
-        <w:rPr>
-          <w:rFonts w:ascii="Times New Roman" w:hAnsi="Times New Roman"/>
-        </w:rPr>
-        <w:t xml:space="preserve">.  </w:t>
-      </w:r>
-      <w:r>
-        <w:rPr>
-          <w:rFonts w:ascii="Times New Roman" w:hAnsi="Times New Roman"/>
-        </w:rPr>
-        <w:t>The negotiation, any Recipient due diligence investigations, or the expenditure of funds will not be regarded as partial performance of a binding transaction contract or create the right to assert claims or damages.</w:t>
+          <w:b/>
+        </w:rPr>
+        <w:t xml:space="preserve">Not a Contract:  </w:t>
+      </w:r>
+      <w:r>
+        <w:rPr>
+          <w:rFonts w:ascii="Times New Roman" w:hAnsi="Times New Roman"/>
+        </w:rPr>
+        <w:t>Both parties reserve the right to terminate negotiations and reject any proposal for any reason, prior to execution of definitive transaction documents.  The negotiation, any Recipient due diligence investigations, or the expenditure of funds will not be regarded as partial performance of a binding transaction contract or create the right to assert claims or damages.</w:t>
       </w:r>
     </w:p>
     <w:p>
@@ -786,13 +723,14 @@
         <w:rPr>
           <w:rFonts w:ascii="Times New Roman" w:hAnsi="Times New Roman"/>
         </w:rPr>
-        <w:t xml:space="preserve"> Paragraph headings are for convenience only.  This Agreement may be executed by facsimile transmission and in multiple counterparts, each of which shall be </w:t>
-      </w:r>
-      <w:r>
-        <w:rPr>
-          <w:rFonts w:ascii="Times New Roman" w:hAnsi="Times New Roman"/>
-        </w:rPr>
-        <w:t xml:space="preserve">deemed the same agreement.  Failure or delay in insisting on strict performance is not a waiver. This Agreement constitutes the entire agreement and supersedes all prior oral discussions or written </w:t>
+        <w:t xml:space="preserve"> Paragraph headings are for convenience only.  This Agreement may be executed by facsimile transmission and in multiple counterparts, each of which shall be deemed the same agreement.  Failure or delay in insisting on strict performance is not a waiver. This Agreement constitutes the entire agreement and supersedes all prior oral discussions or </w:t>
+      </w:r>
+      <w:r>
+        <w:rPr>
+          <w:rFonts w:ascii="Times New Roman" w:hAnsi="Times New Roman"/>
+        </w:rPr>
+        <w:lastRenderedPageBreak/>
+        <w:t xml:space="preserve">written </w:t>
       </w:r>
       <w:proofErr w:type="gramStart"/>
       <w:r>
@@ -826,6 +764,7 @@
         <w:rPr>
           <w:rFonts w:ascii="Times New Roman" w:hAnsi="Times New Roman"/>
         </w:rPr>
+        <w:lastRenderedPageBreak/>
         <w:t xml:space="preserve">If you are in agreement with the foregoing, please sign and return one copy of this Agreement, retaining the additional copy for your records, to the attention of </w:t>
       </w:r>
       <w:r>
@@ -1475,13 +1414,8 @@
       </w:r>
     </w:p>
     <w:sectPr>
-      <w:headerReference w:type="even" r:id="rId7"/>
-      <w:headerReference w:type="default" r:id="rId8"/>
-      <w:footerReference w:type="even" r:id="rId9"/>
-      <w:footerReference w:type="default" r:id="rId10"/>
-      <w:headerReference w:type="first" r:id="rId11"/>
-      <w:footerReference w:type="first" r:id="rId12"/>
-      <w:pgSz w:w="12240" w:h="15840" w:orient="portrait"/>
+      <w:headerReference w:type="default" r:id="rId7"/>
+      <w:pgSz w:w="12240" w:h="15840"/>
       <w:pgMar w:top="1440" w:right="1440" w:bottom="1440" w:left="1440" w:header="1008" w:footer="720" w:gutter="0"/>
       <w:cols w:space="720"/>
       <w:titlePg/>
@@ -1509,36 +1443,6 @@
 </w:endnotes>
 </file>
 
-<file path=word/footer1.xml><?xml version="1.0" encoding="utf-8"?>
-<w:ftr xmlns:wpc="http://schemas.microsoft.com/office/word/2010/wordprocessingCanvas" xmlns:cx="http://schemas.microsoft.com/office/drawing/2014/chartex" xmlns:cx1="http://schemas.microsoft.com/office/drawing/2015/9/8/chartex" xmlns:cx2="http://schemas.microsoft.com/office/drawing/2015/10/21/chartex" xmlns:cx3="http://schemas.microsoft.com/office/drawing/2016/5/9/chartex" xmlns:cx4="http://schemas.microsoft.com/office/drawing/2016/5/10/chartex" xmlns:cx5="http://schemas.microsoft.com/office/drawing/2016/5/11/chartex" xmlns:cx6="http://schemas.microsoft.com/office/drawing/2016/5/12/chartex" xmlns:cx7="http://schemas.microsoft.com/office/drawing/2016/5/13/chartex" xmlns:cx8="http://schemas.microsoft.com/office/drawing/2016/5/14/chartex" xmlns:mc="http://schemas.openxmlformats.org/markup-compatibility/2006" xmlns:m="http://schemas.openxmlformats.org/officeDocument/2006/math" xmlns:aink="http://schemas.microsoft.com/office/drawing/2016/ink" xmlns:am3d="http://schemas.microsoft.com/office/drawing/2017/model3d" xmlns:oel="http://schemas.microsoft.com/office/2019/extlst" xmlns:r="http://schemas.openxmlformats.org/officeDocument/2006/relationships" xmlns:wp14="http://schemas.microsoft.com/office/word/2010/wordprocessingDrawing" xmlns:wp="http://schemas.openxmlformats.org/drawingml/2006/wordprocessingDrawing" xmlns:wpg="http://schemas.microsoft.com/office/word/2010/wordprocessingGroup" xmlns:wpi="http://schemas.microsoft.com/office/word/2010/wordprocessingInk" xmlns:wps="http://schemas.microsoft.com/office/word/2010/wordprocessingShape" xmlns:o="urn:schemas-microsoft-com:office:office" xmlns:v="urn:schemas-microsoft-com:vml" xmlns:w10="urn:schemas-microsoft-com:office:word" xmlns:w="http://schemas.openxmlformats.org/wordprocessingml/2006/main" xmlns:w14="http://schemas.microsoft.com/office/word/2010/wordml" xmlns:w15="http://schemas.microsoft.com/office/word/2012/wordml" xmlns:w16cei="http://schemas.microsoft.com/office/word/2026/wordml/cei" xmlns:w16cex="http://schemas.microsoft.com/office/word/2018/wordml/cex" xmlns:w16cid="http://schemas.microsoft.com/office/word/2016/wordml/cid" xmlns:w16="http://schemas.microsoft.com/office/word/2018/wordml" xmlns:w16sdtdh="http://schemas.microsoft.com/office/word/2020/wordml/sdtdatahash" xmlns:w16sdtfl="http://schemas.microsoft.com/office/word/2024/wordml/sdtformatlock" xmlns:w16se="http://schemas.microsoft.com/office/word/2015/wordml/symex" xmlns:w16du="http://schemas.microsoft.com/office/word/2023/wordml/word16du" xmlns:wne="http://schemas.microsoft.com/office/word/2006/wordml" mc:Ignorable="w14 w15 w16se w16cid w16 w16cex w16sdtdh w16sdtfl w16du wp14">
-  <w:p>
-    <w:pPr>
-      <w:pStyle w:val="Footer"/>
-    </w:pPr>
-  </w:p>
-</w:ftr>
-</file>
-
-<file path=word/footer2.xml><?xml version="1.0" encoding="utf-8"?>
-<w:ftr xmlns:wpc="http://schemas.microsoft.com/office/word/2010/wordprocessingCanvas" xmlns:cx="http://schemas.microsoft.com/office/drawing/2014/chartex" xmlns:cx1="http://schemas.microsoft.com/office/drawing/2015/9/8/chartex" xmlns:cx2="http://schemas.microsoft.com/office/drawing/2015/10/21/chartex" xmlns:cx3="http://schemas.microsoft.com/office/drawing/2016/5/9/chartex" xmlns:cx4="http://schemas.microsoft.com/office/drawing/2016/5/10/chartex" xmlns:cx5="http://schemas.microsoft.com/office/drawing/2016/5/11/chartex" xmlns:cx6="http://schemas.microsoft.com/office/drawing/2016/5/12/chartex" xmlns:cx7="http://schemas.microsoft.com/office/drawing/2016/5/13/chartex" xmlns:cx8="http://schemas.microsoft.com/office/drawing/2016/5/14/chartex" xmlns:mc="http://schemas.openxmlformats.org/markup-compatibility/2006" xmlns:m="http://schemas.openxmlformats.org/officeDocument/2006/math" xmlns:aink="http://schemas.microsoft.com/office/drawing/2016/ink" xmlns:am3d="http://schemas.microsoft.com/office/drawing/2017/model3d" xmlns:oel="http://schemas.microsoft.com/office/2019/extlst" xmlns:r="http://schemas.openxmlformats.org/officeDocument/2006/relationships" xmlns:wp14="http://schemas.microsoft.com/office/word/2010/wordprocessingDrawing" xmlns:wp="http://schemas.openxmlformats.org/drawingml/2006/wordprocessingDrawing" xmlns:wpg="http://schemas.microsoft.com/office/word/2010/wordprocessingGroup" xmlns:wpi="http://schemas.microsoft.com/office/word/2010/wordprocessingInk" xmlns:wps="http://schemas.microsoft.com/office/word/2010/wordprocessingShape" xmlns:o="urn:schemas-microsoft-com:office:office" xmlns:v="urn:schemas-microsoft-com:vml" xmlns:w10="urn:schemas-microsoft-com:office:word" xmlns:w="http://schemas.openxmlformats.org/wordprocessingml/2006/main" xmlns:w14="http://schemas.microsoft.com/office/word/2010/wordml" xmlns:w15="http://schemas.microsoft.com/office/word/2012/wordml" xmlns:w16cei="http://schemas.microsoft.com/office/word/2026/wordml/cei" xmlns:w16cex="http://schemas.microsoft.com/office/word/2018/wordml/cex" xmlns:w16cid="http://schemas.microsoft.com/office/word/2016/wordml/cid" xmlns:w16="http://schemas.microsoft.com/office/word/2018/wordml" xmlns:w16sdtdh="http://schemas.microsoft.com/office/word/2020/wordml/sdtdatahash" xmlns:w16sdtfl="http://schemas.microsoft.com/office/word/2024/wordml/sdtformatlock" xmlns:w16se="http://schemas.microsoft.com/office/word/2015/wordml/symex" xmlns:w16du="http://schemas.microsoft.com/office/word/2023/wordml/word16du" xmlns:wne="http://schemas.microsoft.com/office/word/2006/wordml" mc:Ignorable="w14 w15 w16se w16cid w16 w16cex w16sdtdh w16sdtfl w16du wp14">
-  <w:p>
-    <w:pPr>
-      <w:pStyle w:val="Footer"/>
-    </w:pPr>
-  </w:p>
-</w:ftr>
-</file>
-
-<file path=word/footer3.xml><?xml version="1.0" encoding="utf-8"?>
-<w:ftr xmlns:wpc="http://schemas.microsoft.com/office/word/2010/wordprocessingCanvas" xmlns:cx="http://schemas.microsoft.com/office/drawing/2014/chartex" xmlns:cx1="http://schemas.microsoft.com/office/drawing/2015/9/8/chartex" xmlns:cx2="http://schemas.microsoft.com/office/drawing/2015/10/21/chartex" xmlns:cx3="http://schemas.microsoft.com/office/drawing/2016/5/9/chartex" xmlns:cx4="http://schemas.microsoft.com/office/drawing/2016/5/10/chartex" xmlns:cx5="http://schemas.microsoft.com/office/drawing/2016/5/11/chartex" xmlns:cx6="http://schemas.microsoft.com/office/drawing/2016/5/12/chartex" xmlns:cx7="http://schemas.microsoft.com/office/drawing/2016/5/13/chartex" xmlns:cx8="http://schemas.microsoft.com/office/drawing/2016/5/14/chartex" xmlns:mc="http://schemas.openxmlformats.org/markup-compatibility/2006" xmlns:m="http://schemas.openxmlformats.org/officeDocument/2006/math" xmlns:aink="http://schemas.microsoft.com/office/drawing/2016/ink" xmlns:am3d="http://schemas.microsoft.com/office/drawing/2017/model3d" xmlns:oel="http://schemas.microsoft.com/office/2019/extlst" xmlns:r="http://schemas.openxmlformats.org/officeDocument/2006/relationships" xmlns:wp14="http://schemas.microsoft.com/office/word/2010/wordprocessingDrawing" xmlns:wp="http://schemas.openxmlformats.org/drawingml/2006/wordprocessingDrawing" xmlns:wpg="http://schemas.microsoft.com/office/word/2010/wordprocessingGroup" xmlns:wpi="http://schemas.microsoft.com/office/word/2010/wordprocessingInk" xmlns:wps="http://schemas.microsoft.com/office/word/2010/wordprocessingShape" xmlns:o="urn:schemas-microsoft-com:office:office" xmlns:v="urn:schemas-microsoft-com:vml" xmlns:w10="urn:schemas-microsoft-com:office:word" xmlns:w="http://schemas.openxmlformats.org/wordprocessingml/2006/main" xmlns:w14="http://schemas.microsoft.com/office/word/2010/wordml" xmlns:w15="http://schemas.microsoft.com/office/word/2012/wordml" xmlns:w16cei="http://schemas.microsoft.com/office/word/2026/wordml/cei" xmlns:w16cex="http://schemas.microsoft.com/office/word/2018/wordml/cex" xmlns:w16cid="http://schemas.microsoft.com/office/word/2016/wordml/cid" xmlns:w16="http://schemas.microsoft.com/office/word/2018/wordml" xmlns:w16sdtdh="http://schemas.microsoft.com/office/word/2020/wordml/sdtdatahash" xmlns:w16sdtfl="http://schemas.microsoft.com/office/word/2024/wordml/sdtformatlock" xmlns:w16se="http://schemas.microsoft.com/office/word/2015/wordml/symex" xmlns:w16du="http://schemas.microsoft.com/office/word/2023/wordml/word16du" xmlns:wne="http://schemas.microsoft.com/office/word/2006/wordml" mc:Ignorable="w14 w15 w16se w16cid w16 w16cex w16sdtdh w16sdtfl w16du wp14">
-  <w:p>
-    <w:pPr>
-      <w:pStyle w:val="Footer"/>
-    </w:pPr>
-  </w:p>
-</w:ftr>
-</file>
-
 <file path=word/footnotes.xml><?xml version="1.0" encoding="utf-8"?>
 <w:footnotes xmlns:wpc="http://schemas.microsoft.com/office/word/2010/wordprocessingCanvas" xmlns:cx="http://schemas.microsoft.com/office/drawing/2014/chartex" xmlns:cx1="http://schemas.microsoft.com/office/drawing/2015/9/8/chartex" xmlns:cx2="http://schemas.microsoft.com/office/drawing/2015/10/21/chartex" xmlns:cx3="http://schemas.microsoft.com/office/drawing/2016/5/9/chartex" xmlns:cx4="http://schemas.microsoft.com/office/drawing/2016/5/10/chartex" xmlns:cx5="http://schemas.microsoft.com/office/drawing/2016/5/11/chartex" xmlns:cx6="http://schemas.microsoft.com/office/drawing/2016/5/12/chartex" xmlns:cx7="http://schemas.microsoft.com/office/drawing/2016/5/13/chartex" xmlns:cx8="http://schemas.microsoft.com/office/drawing/2016/5/14/chartex" xmlns:mc="http://schemas.openxmlformats.org/markup-compatibility/2006" xmlns:m="http://schemas.openxmlformats.org/officeDocument/2006/math" xmlns:aink="http://schemas.microsoft.com/office/drawing/2016/ink" xmlns:am3d="http://schemas.microsoft.com/office/drawing/2017/model3d" xmlns:oel="http://schemas.microsoft.com/office/2019/extlst" xmlns:r="http://schemas.openxmlformats.org/officeDocument/2006/relationships" xmlns:wp14="http://schemas.microsoft.com/office/word/2010/wordprocessingDrawing" xmlns:wp="http://schemas.openxmlformats.org/drawingml/2006/wordprocessingDrawing" xmlns:wpg="http://schemas.microsoft.com/office/word/2010/wordprocessingGroup" xmlns:wpi="http://schemas.microsoft.com/office/word/2010/wordprocessingInk" xmlns:wps="http://schemas.microsoft.com/office/word/2010/wordprocessingShape" xmlns:o="urn:schemas-microsoft-com:office:office" xmlns:v="urn:schemas-microsoft-com:vml" xmlns:w10="urn:schemas-microsoft-com:office:word" xmlns:w="http://schemas.openxmlformats.org/wordprocessingml/2006/main" xmlns:w14="http://schemas.microsoft.com/office/word/2010/wordml" xmlns:w15="http://schemas.microsoft.com/office/word/2012/wordml" xmlns:w16cei="http://schemas.microsoft.com/office/word/2026/wordml/cei" xmlns:w16cex="http://schemas.microsoft.com/office/word/2018/wordml/cex" xmlns:w16cid="http://schemas.microsoft.com/office/word/2016/wordml/cid" xmlns:w16="http://schemas.microsoft.com/office/word/2018/wordml" xmlns:w16sdtdh="http://schemas.microsoft.com/office/word/2020/wordml/sdtdatahash" xmlns:w16sdtfl="http://schemas.microsoft.com/office/word/2024/wordml/sdtformatlock" xmlns:w16se="http://schemas.microsoft.com/office/word/2015/wordml/symex" xmlns:w16du="http://schemas.microsoft.com/office/word/2023/wordml/word16du" xmlns:wne="http://schemas.microsoft.com/office/word/2006/wordml" mc:Ignorable="w14 w15 w16se w16cid w16 w16cex w16sdtdh w16sdtfl w16du wp14">
   <w:footnote w:type="separator" w:id="-1">
@@ -1563,16 +1467,6 @@
   <w:p>
     <w:pPr>
       <w:pStyle w:val="Header"/>
-    </w:pPr>
-  </w:p>
-</w:hdr>
-</file>
-
-<file path=word/header2.xml><?xml version="1.0" encoding="utf-8"?>
-<w:hdr xmlns:wpc="http://schemas.microsoft.com/office/word/2010/wordprocessingCanvas" xmlns:cx="http://schemas.microsoft.com/office/drawing/2014/chartex" xmlns:cx1="http://schemas.microsoft.com/office/drawing/2015/9/8/chartex" xmlns:cx2="http://schemas.microsoft.com/office/drawing/2015/10/21/chartex" xmlns:cx3="http://schemas.microsoft.com/office/drawing/2016/5/9/chartex" xmlns:cx4="http://schemas.microsoft.com/office/drawing/2016/5/10/chartex" xmlns:cx5="http://schemas.microsoft.com/office/drawing/2016/5/11/chartex" xmlns:cx6="http://schemas.microsoft.com/office/drawing/2016/5/12/chartex" xmlns:cx7="http://schemas.microsoft.com/office/drawing/2016/5/13/chartex" xmlns:cx8="http://schemas.microsoft.com/office/drawing/2016/5/14/chartex" xmlns:mc="http://schemas.openxmlformats.org/markup-compatibility/2006" xmlns:m="http://schemas.openxmlformats.org/officeDocument/2006/math" xmlns:aink="http://schemas.microsoft.com/office/drawing/2016/ink" xmlns:am3d="http://schemas.microsoft.com/office/drawing/2017/model3d" xmlns:oel="http://schemas.microsoft.com/office/2019/extlst" xmlns:r="http://schemas.openxmlformats.org/officeDocument/2006/relationships" xmlns:wp14="http://schemas.microsoft.com/office/word/2010/wordprocessingDrawing" xmlns:wp="http://schemas.openxmlformats.org/drawingml/2006/wordprocessingDrawing" xmlns:wpg="http://schemas.microsoft.com/office/word/2010/wordprocessingGroup" xmlns:wpi="http://schemas.microsoft.com/office/word/2010/wordprocessingInk" xmlns:wps="http://schemas.microsoft.com/office/word/2010/wordprocessingShape" xmlns:o="urn:schemas-microsoft-com:office:office" xmlns:v="urn:schemas-microsoft-com:vml" xmlns:w10="urn:schemas-microsoft-com:office:word" xmlns:w="http://schemas.openxmlformats.org/wordprocessingml/2006/main" xmlns:w14="http://schemas.microsoft.com/office/word/2010/wordml" xmlns:w15="http://schemas.microsoft.com/office/word/2012/wordml" xmlns:w16cei="http://schemas.microsoft.com/office/word/2026/wordml/cei" xmlns:w16cex="http://schemas.microsoft.com/office/word/2018/wordml/cex" xmlns:w16cid="http://schemas.microsoft.com/office/word/2016/wordml/cid" xmlns:w16="http://schemas.microsoft.com/office/word/2018/wordml" xmlns:w16sdtdh="http://schemas.microsoft.com/office/word/2020/wordml/sdtdatahash" xmlns:w16sdtfl="http://schemas.microsoft.com/office/word/2024/wordml/sdtformatlock" xmlns:w16se="http://schemas.microsoft.com/office/word/2015/wordml/symex" xmlns:w16du="http://schemas.microsoft.com/office/word/2023/wordml/word16du" xmlns:wne="http://schemas.microsoft.com/office/word/2006/wordml" mc:Ignorable="w14 w15 w16se w16cid w16 w16cex w16sdtdh w16sdtfl w16du wp14">
-  <w:p w14:noSpellErr="1">
-    <w:pPr>
-      <w:pStyle w:val="Header"/>
       <w:tabs>
         <w:tab w:val="clear" w:pos="4320"/>
         <w:tab w:val="clear" w:pos="8640"/>
@@ -1580,123 +1474,74 @@
         <w:tab w:val="right" w:pos="9360"/>
       </w:tabs>
       <w:rPr>
-        <w:i w:val="1"/>
-        <w:iCs w:val="1"/>
+        <w:i/>
+        <w:iCs/>
         <w:sz w:val="20"/>
-        <w:szCs w:val="20"/>
         <w:u w:val="single"/>
       </w:rPr>
     </w:pPr>
     <w:r>
       <w:rPr>
-        <w:i w:val="1"/>
-        <w:iCs w:val="1"/>
+        <w:i/>
         <w:sz w:val="20"/>
-        <w:szCs w:val="20"/>
         <w:u w:val="single"/>
       </w:rPr>
       <w:t xml:space="preserve">Confidentiality Agreement </w:t>
     </w:r>
     <w:r>
       <w:rPr>
-        <w:i w:val="1"/>
-        <w:iCs w:val="1"/>
+        <w:i/>
         <w:sz w:val="20"/>
-        <w:szCs w:val="20"/>
         <w:u w:val="single"/>
       </w:rPr>
       <w:t xml:space="preserve">– </w:t>
     </w:r>
     <w:r>
       <w:rPr>
-        <w:i w:val="1"/>
-        <w:iCs w:val="1"/>
+        <w:i/>
         <w:sz w:val="20"/>
-        <w:szCs w:val="20"/>
         <w:u w:val="single"/>
       </w:rPr>
       <w:t xml:space="preserve">Cascades </w:t>
     </w:r>
     <w:r>
       <w:rPr>
-        <w:i w:val="1"/>
-        <w:iCs w:val="1"/>
+        <w:i/>
         <w:sz w:val="20"/>
-        <w:szCs w:val="20"/>
         <w:u w:val="single"/>
       </w:rPr>
-      <w:t>The</w:t>
+      <w:t xml:space="preserve">at </w:t>
     </w:r>
     <w:r>
       <w:rPr>
-        <w:i w:val="1"/>
-        <w:iCs w:val="1"/>
+        <w:i/>
         <w:sz w:val="20"/>
-        <w:szCs w:val="20"/>
         <w:u w:val="single"/>
       </w:rPr>
-      <w:t xml:space="preserve"> Colony Portfolio</w:t>
+      <w:t>The Colony Portfoli</w:t>
     </w:r>
     <w:r>
       <w:rPr>
-        <w:i w:val="1"/>
-        <w:iCs w:val="1"/>
+        <w:i/>
         <w:sz w:val="20"/>
-        <w:szCs w:val="20"/>
         <w:u w:val="single"/>
       </w:rPr>
-      <w:t xml:space="preserve"> – </w:t>
+      <w:t>o</w:t>
     </w:r>
     <w:r>
       <w:rPr>
-        <w:i w:val="1"/>
-        <w:iCs w:val="1"/>
+        <w:i/>
         <w:sz w:val="20"/>
-        <w:szCs w:val="20"/>
         <w:u w:val="single"/>
       </w:rPr>
-      <w:t>The Colony</w:t>
-    </w:r>
-    <w:r>
-      <w:rPr>
-        <w:i w:val="1"/>
-        <w:iCs w:val="1"/>
-        <w:sz w:val="20"/>
-        <w:szCs w:val="20"/>
-        <w:u w:val="single"/>
-      </w:rPr>
-      <w:t>, TX</w:t>
-    </w:r>
-    <w:r>
       <w:tab/>
-    </w:r>
-    <w:r>
-      <w:rPr>
-        <w:i w:val="1"/>
-        <w:iCs w:val="1"/>
-        <w:sz w:val="20"/>
-        <w:szCs w:val="20"/>
-        <w:u w:val="single"/>
-      </w:rPr>
-      <w:t xml:space="preserve"> </w:t>
-    </w:r>
-    <w:r>
-      <w:rPr>
-        <w:i w:val="1"/>
-        <w:iCs w:val="1"/>
-        <w:sz w:val="20"/>
-        <w:szCs w:val="20"/>
-        <w:u w:val="single"/>
-      </w:rPr>
       <w:t xml:space="preserve">Page </w:t>
     </w:r>
     <w:r>
       <w:rPr>
         <w:rStyle w:val="PageNumber"/>
-        <w:i w:val="1"/>
-        <w:iCs w:val="1"/>
+        <w:i/>
         <w:sz w:val="20"/>
-        <w:szCs w:val="20"/>
         <w:u w:val="single"/>
       </w:rPr>
       <w:fldChar w:fldCharType="begin"/>
@@ -1704,10 +1549,8 @@
     <w:r>
       <w:rPr>
         <w:rStyle w:val="PageNumber"/>
-        <w:i w:val="1"/>
-        <w:iCs w:val="1"/>
+        <w:i/>
         <w:sz w:val="20"/>
-        <w:szCs w:val="20"/>
         <w:u w:val="single"/>
       </w:rPr>
       <w:instrText xml:space="preserve"> PAGE </w:instrText>
@@ -1715,10 +1558,8 @@
     <w:r>
       <w:rPr>
         <w:rStyle w:val="PageNumber"/>
-        <w:i w:val="1"/>
-        <w:iCs w:val="1"/>
+        <w:i/>
         <w:sz w:val="20"/>
-        <w:szCs w:val="20"/>
         <w:u w:val="single"/>
       </w:rPr>
       <w:fldChar w:fldCharType="separate"/>
@@ -1726,11 +1567,9 @@
     <w:r>
       <w:rPr>
         <w:rStyle w:val="PageNumber"/>
-        <w:i w:val="1"/>
-        <w:iCs w:val="1"/>
+        <w:i/>
         <w:noProof/>
         <w:sz w:val="20"/>
-        <w:szCs w:val="20"/>
         <w:u w:val="single"/>
       </w:rPr>
       <w:t>3</w:t>
@@ -1738,25 +1577,12 @@
     <w:r>
       <w:rPr>
         <w:rStyle w:val="PageNumber"/>
-        <w:i w:val="1"/>
-        <w:iCs w:val="1"/>
-        <w:noProof/>
+        <w:i/>
         <w:sz w:val="20"/>
-        <w:szCs w:val="20"/>
         <w:u w:val="single"/>
       </w:rPr>
       <w:fldChar w:fldCharType="end"/>
     </w:r>
-  </w:p>
-</w:hdr>
-</file>
-
-<file path=word/header3.xml><?xml version="1.0" encoding="utf-8"?>
-<w:hdr xmlns:wpc="http://schemas.microsoft.com/office/word/2010/wordprocessingCanvas" xmlns:cx="http://schemas.microsoft.com/office/drawing/2014/chartex" xmlns:cx1="http://schemas.microsoft.com/office/drawing/2015/9/8/chartex" xmlns:cx2="http://schemas.microsoft.com/office/drawing/2015/10/21/chartex" xmlns:cx3="http://schemas.microsoft.com/office/drawing/2016/5/9/chartex" xmlns:cx4="http://schemas.microsoft.com/office/drawing/2016/5/10/chartex" xmlns:cx5="http://schemas.microsoft.com/office/drawing/2016/5/11/chartex" xmlns:cx6="http://schemas.microsoft.com/office/drawing/2016/5/12/chartex" xmlns:cx7="http://schemas.microsoft.com/office/drawing/2016/5/13/chartex" xmlns:cx8="http://schemas.microsoft.com/office/drawing/2016/5/14/chartex" xmlns:mc="http://schemas.openxmlformats.org/markup-compatibility/2006" xmlns:m="http://schemas.openxmlformats.org/officeDocument/2006/math" xmlns:aink="http://schemas.microsoft.com/office/drawing/2016/ink" xmlns:am3d="http://schemas.microsoft.com/office/drawing/2017/model3d" xmlns:oel="http://schemas.microsoft.com/office/2019/extlst" xmlns:r="http://schemas.openxmlformats.org/officeDocument/2006/relationships" xmlns:wp14="http://schemas.microsoft.com/office/word/2010/wordprocessingDrawing" xmlns:wp="http://schemas.openxmlformats.org/drawingml/2006/wordprocessingDrawing" xmlns:wpg="http://schemas.microsoft.com/office/word/2010/wordprocessingGroup" xmlns:wpi="http://schemas.microsoft.com/office/word/2010/wordprocessingInk" xmlns:wps="http://schemas.microsoft.com/office/word/2010/wordprocessingShape" xmlns:o="urn:schemas-microsoft-com:office:office" xmlns:v="urn:schemas-microsoft-com:vml" xmlns:w10="urn:schemas-microsoft-com:office:word" xmlns:w="http://schemas.openxmlformats.org/wordprocessingml/2006/main" xmlns:w14="http://schemas.microsoft.com/office/word/2010/wordml" xmlns:w15="http://schemas.microsoft.com/office/word/2012/wordml" xmlns:w16cei="http://schemas.microsoft.com/office/word/2026/wordml/cei" xmlns:w16cex="http://schemas.microsoft.com/office/word/2018/wordml/cex" xmlns:w16cid="http://schemas.microsoft.com/office/word/2016/wordml/cid" xmlns:w16="http://schemas.microsoft.com/office/word/2018/wordml" xmlns:w16sdtdh="http://schemas.microsoft.com/office/word/2020/wordml/sdtdatahash" xmlns:w16sdtfl="http://schemas.microsoft.com/office/word/2024/wordml/sdtformatlock" xmlns:w16se="http://schemas.microsoft.com/office/word/2015/wordml/symex" xmlns:w16du="http://schemas.microsoft.com/office/word/2023/wordml/word16du" xmlns:wne="http://schemas.microsoft.com/office/word/2006/wordml" mc:Ignorable="w14 w15 w16se w16cid w16 w16cex w16sdtdh w16sdtfl w16du wp14">
-  <w:p>
-    <w:pPr>
-      <w:pStyle w:val="Header"/>
-    </w:pPr>
   </w:p>
 </w:hdr>
 </file>
@@ -1978,11 +1804,11 @@
 </file>
 
 <file path=word/styles.xml><?xml version="1.0" encoding="utf-8"?>
-<w:styles xmlns:wp14="http://schemas.microsoft.com/office/word/2010/wordprocessingDrawing" xmlns:mc="http://schemas.openxmlformats.org/markup-compatibility/2006" xmlns:r="http://schemas.openxmlformats.org/officeDocument/2006/relationships" xmlns:w="http://schemas.openxmlformats.org/wordprocessingml/2006/main" xmlns:w14="http://schemas.microsoft.com/office/word/2010/wordml" xmlns:w15="http://schemas.microsoft.com/office/word/2012/wordml" xmlns:w16cex="http://schemas.microsoft.com/office/word/2018/wordml/cex" xmlns:w16cid="http://schemas.microsoft.com/office/word/2016/wordml/cid" xmlns:w16="http://schemas.microsoft.com/office/word/2018/wordml" xmlns:w16sdtdh="http://schemas.microsoft.com/office/word/2020/wordml/sdtdatahash" xmlns:w16sdtfl="http://schemas.microsoft.com/office/word/2024/wordml/sdtformatlock" xmlns:w16se="http://schemas.microsoft.com/office/word/2015/wordml/symex" xmlns:w16du="http://schemas.microsoft.com/office/word/2023/wordml/word16du" mc:Ignorable="w14 w15 w16se w16cid w16 w16cex w16sdtdh w16sdtfl w16du wp14">
+<w:styles xmlns:mc="http://schemas.openxmlformats.org/markup-compatibility/2006" xmlns:r="http://schemas.openxmlformats.org/officeDocument/2006/relationships" xmlns:w="http://schemas.openxmlformats.org/wordprocessingml/2006/main" xmlns:w14="http://schemas.microsoft.com/office/word/2010/wordml" xmlns:w15="http://schemas.microsoft.com/office/word/2012/wordml" xmlns:w16cex="http://schemas.microsoft.com/office/word/2018/wordml/cex" xmlns:w16cid="http://schemas.microsoft.com/office/word/2016/wordml/cid" xmlns:w16="http://schemas.microsoft.com/office/word/2018/wordml" xmlns:w16sdtdh="http://schemas.microsoft.com/office/word/2020/wordml/sdtdatahash" xmlns:w16sdtfl="http://schemas.microsoft.com/office/word/2024/wordml/sdtformatlock" xmlns:w16se="http://schemas.microsoft.com/office/word/2015/wordml/symex" xmlns:w16du="http://schemas.microsoft.com/office/word/2023/wordml/word16du" mc:Ignorable="w14 w15 w16se w16cid w16 w16cex w16sdtdh w16sdtfl w16du">
   <w:docDefaults>
     <w:rPrDefault>
       <w:rPr>
-        <w:rFonts w:ascii="Times" w:hAnsi="Times" w:eastAsia="Times New Roman" w:cs="Times New Roman"/>
+        <w:rFonts w:ascii="Times" w:eastAsia="Times New Roman" w:hAnsi="Times" w:cs="Times New Roman"/>
         <w:lang w:val="en-US" w:eastAsia="en-US" w:bidi="ar-SA"/>
       </w:rPr>
     </w:rPrDefault>
@@ -1991,14 +1817,14 @@
   <w:latentStyles w:defLockedState="0" w:defUIPriority="99" w:defSemiHidden="0" w:defUnhideWhenUsed="0" w:defQFormat="0" w:count="376">
     <w:lsdException w:name="Normal" w:uiPriority="0" w:qFormat="1"/>
     <w:lsdException w:name="heading 1" w:uiPriority="9" w:qFormat="1"/>
-    <w:lsdException w:name="heading 2" w:uiPriority="9" w:semiHidden="1" w:unhideWhenUsed="1" w:qFormat="1"/>
-    <w:lsdException w:name="heading 3" w:uiPriority="9" w:semiHidden="1" w:unhideWhenUsed="1" w:qFormat="1"/>
-    <w:lsdException w:name="heading 4" w:uiPriority="9" w:semiHidden="1" w:unhideWhenUsed="1" w:qFormat="1"/>
-    <w:lsdException w:name="heading 5" w:uiPriority="9" w:semiHidden="1" w:unhideWhenUsed="1" w:qFormat="1"/>
-    <w:lsdException w:name="heading 6" w:uiPriority="9" w:semiHidden="1" w:unhideWhenUsed="1" w:qFormat="1"/>
-    <w:lsdException w:name="heading 7" w:uiPriority="9" w:semiHidden="1" w:unhideWhenUsed="1" w:qFormat="1"/>
-    <w:lsdException w:name="heading 8" w:uiPriority="9" w:semiHidden="1" w:unhideWhenUsed="1" w:qFormat="1"/>
-    <w:lsdException w:name="heading 9" w:uiPriority="9" w:semiHidden="1" w:unhideWhenUsed="1" w:qFormat="1"/>
+    <w:lsdException w:name="heading 2" w:semiHidden="1" w:uiPriority="9" w:unhideWhenUsed="1" w:qFormat="1"/>
+    <w:lsdException w:name="heading 3" w:semiHidden="1" w:uiPriority="9" w:unhideWhenUsed="1" w:qFormat="1"/>
+    <w:lsdException w:name="heading 4" w:semiHidden="1" w:uiPriority="9" w:unhideWhenUsed="1" w:qFormat="1"/>
+    <w:lsdException w:name="heading 5" w:semiHidden="1" w:uiPriority="9" w:unhideWhenUsed="1" w:qFormat="1"/>
+    <w:lsdException w:name="heading 6" w:semiHidden="1" w:uiPriority="9" w:unhideWhenUsed="1" w:qFormat="1"/>
+    <w:lsdException w:name="heading 7" w:semiHidden="1" w:uiPriority="9" w:unhideWhenUsed="1" w:qFormat="1"/>
+    <w:lsdException w:name="heading 8" w:semiHidden="1" w:uiPriority="9" w:unhideWhenUsed="1" w:qFormat="1"/>
+    <w:lsdException w:name="heading 9" w:semiHidden="1" w:uiPriority="9" w:unhideWhenUsed="1" w:qFormat="1"/>
     <w:lsdException w:name="index 1" w:semiHidden="1" w:unhideWhenUsed="1"/>
     <w:lsdException w:name="index 2" w:semiHidden="1" w:unhideWhenUsed="1"/>
     <w:lsdException w:name="index 3" w:semiHidden="1" w:unhideWhenUsed="1"/>
@@ -2008,22 +1834,22 @@
     <w:lsdException w:name="index 7" w:semiHidden="1" w:unhideWhenUsed="1"/>
     <w:lsdException w:name="index 8" w:semiHidden="1" w:unhideWhenUsed="1"/>
     <w:lsdException w:name="index 9" w:semiHidden="1" w:unhideWhenUsed="1"/>
-    <w:lsdException w:name="toc 1" w:uiPriority="39" w:semiHidden="1" w:unhideWhenUsed="1"/>
-    <w:lsdException w:name="toc 2" w:uiPriority="39" w:semiHidden="1" w:unhideWhenUsed="1"/>
-    <w:lsdException w:name="toc 3" w:uiPriority="39" w:semiHidden="1" w:unhideWhenUsed="1"/>
-    <w:lsdException w:name="toc 4" w:uiPriority="39" w:semiHidden="1" w:unhideWhenUsed="1"/>
-    <w:lsdException w:name="toc 5" w:uiPriority="39" w:semiHidden="1" w:unhideWhenUsed="1"/>
-    <w:lsdException w:name="toc 6" w:uiPriority="39" w:semiHidden="1" w:unhideWhenUsed="1"/>
-    <w:lsdException w:name="toc 7" w:uiPriority="39" w:semiHidden="1" w:unhideWhenUsed="1"/>
-    <w:lsdException w:name="toc 8" w:uiPriority="39" w:semiHidden="1" w:unhideWhenUsed="1"/>
-    <w:lsdException w:name="toc 9" w:uiPriority="39" w:semiHidden="1" w:unhideWhenUsed="1"/>
+    <w:lsdException w:name="toc 1" w:semiHidden="1" w:uiPriority="39" w:unhideWhenUsed="1"/>
+    <w:lsdException w:name="toc 2" w:semiHidden="1" w:uiPriority="39" w:unhideWhenUsed="1"/>
+    <w:lsdException w:name="toc 3" w:semiHidden="1" w:uiPriority="39" w:unhideWhenUsed="1"/>
+    <w:lsdException w:name="toc 4" w:semiHidden="1" w:uiPriority="39" w:unhideWhenUsed="1"/>
+    <w:lsdException w:name="toc 5" w:semiHidden="1" w:uiPriority="39" w:unhideWhenUsed="1"/>
+    <w:lsdException w:name="toc 6" w:semiHidden="1" w:uiPriority="39" w:unhideWhenUsed="1"/>
+    <w:lsdException w:name="toc 7" w:semiHidden="1" w:uiPriority="39" w:unhideWhenUsed="1"/>
+    <w:lsdException w:name="toc 8" w:semiHidden="1" w:uiPriority="39" w:unhideWhenUsed="1"/>
+    <w:lsdException w:name="toc 9" w:semiHidden="1" w:uiPriority="39" w:unhideWhenUsed="1"/>
     <w:lsdException w:name="Normal Indent" w:semiHidden="1" w:unhideWhenUsed="1"/>
     <w:lsdException w:name="footnote text" w:semiHidden="1" w:unhideWhenUsed="1"/>
     <w:lsdException w:name="annotation text" w:semiHidden="1" w:unhideWhenUsed="1"/>
     <w:lsdException w:name="header" w:semiHidden="1" w:unhideWhenUsed="1"/>
     <w:lsdException w:name="footer" w:semiHidden="1" w:unhideWhenUsed="1"/>
     <w:lsdException w:name="index heading" w:semiHidden="1" w:unhideWhenUsed="1"/>
-    <w:lsdException w:name="caption" w:uiPriority="35" w:semiHidden="1" w:unhideWhenUsed="1" w:qFormat="1"/>
+    <w:lsdException w:name="caption" w:semiHidden="1" w:uiPriority="35" w:unhideWhenUsed="1" w:qFormat="1"/>
     <w:lsdException w:name="table of figures" w:semiHidden="1" w:unhideWhenUsed="1"/>
     <w:lsdException w:name="envelope address" w:semiHidden="1" w:unhideWhenUsed="1"/>
     <w:lsdException w:name="envelope return" w:semiHidden="1" w:unhideWhenUsed="1"/>
@@ -2054,7 +1880,7 @@
     <w:lsdException w:name="Title" w:uiPriority="10" w:qFormat="1"/>
     <w:lsdException w:name="Closing" w:semiHidden="1" w:unhideWhenUsed="1"/>
     <w:lsdException w:name="Signature" w:semiHidden="1" w:unhideWhenUsed="1"/>
-    <w:lsdException w:name="Default Paragraph Font" w:uiPriority="1" w:semiHidden="1" w:unhideWhenUsed="1"/>
+    <w:lsdException w:name="Default Paragraph Font" w:semiHidden="1" w:uiPriority="1" w:unhideWhenUsed="1"/>
     <w:lsdException w:name="Body Text" w:semiHidden="1" w:unhideWhenUsed="1"/>
     <w:lsdException w:name="Body Text Indent" w:semiHidden="1" w:unhideWhenUsed="1"/>
     <w:lsdException w:name="List Continue" w:semiHidden="1" w:unhideWhenUsed="1"/>
@@ -2146,7 +1972,7 @@
     <w:lsdException w:name="Table Grid" w:uiPriority="59"/>
     <w:lsdException w:name="Table Theme" w:semiHidden="1" w:unhideWhenUsed="1"/>
     <w:lsdException w:name="Placeholder Text" w:semiHidden="1"/>
-    <w:lsdException w:name="No Spacing" w:uiPriority="1" w:semiHidden="1" w:qFormat="1"/>
+    <w:lsdException w:name="No Spacing" w:semiHidden="1" w:uiPriority="1" w:qFormat="1"/>
     <w:lsdException w:name="Light Shading" w:uiPriority="60"/>
     <w:lsdException w:name="Light List" w:uiPriority="61"/>
     <w:lsdException w:name="Light Grid" w:uiPriority="62"/>
@@ -2254,8 +2080,8 @@
     <w:lsdException w:name="Subtle Reference" w:uiPriority="31" w:qFormat="1"/>
     <w:lsdException w:name="Intense Reference" w:uiPriority="32" w:qFormat="1"/>
     <w:lsdException w:name="Book Title" w:uiPriority="33" w:qFormat="1"/>
-    <w:lsdException w:name="Bibliography" w:uiPriority="37" w:semiHidden="1" w:unhideWhenUsed="1"/>
-    <w:lsdException w:name="TOC Heading" w:uiPriority="39" w:semiHidden="1" w:unhideWhenUsed="1" w:qFormat="1"/>
+    <w:lsdException w:name="Bibliography" w:semiHidden="1" w:uiPriority="37" w:unhideWhenUsed="1"/>
+    <w:lsdException w:name="TOC Heading" w:semiHidden="1" w:uiPriority="39" w:unhideWhenUsed="1" w:qFormat="1"/>
     <w:lsdException w:name="Plain Table 1" w:uiPriority="41"/>
     <w:lsdException w:name="Plain Table 2" w:uiPriority="42"/>
     <w:lsdException w:name="Plain Table 3" w:uiPriority="43"/>
@@ -2363,7 +2189,7 @@
     <w:lsdException w:name="Mention" w:semiHidden="1" w:unhideWhenUsed="1"/>
     <w:lsdException w:name="Smart Hyperlink" w:semiHidden="1" w:unhideWhenUsed="1"/>
   </w:latentStyles>
-  <w:style w:type="paragraph" w:styleId="Normal" w:default="1">
+  <w:style w:type="paragraph" w:default="1" w:styleId="Normal">
     <w:name w:val="Normal"/>
     <w:qFormat/>
     <w:rPr>
@@ -2387,12 +2213,13 @@
       <w:u w:val="single"/>
     </w:rPr>
   </w:style>
-  <w:style w:type="character" w:styleId="DefaultParagraphFont" w:default="1">
+  <w:style w:type="character" w:default="1" w:styleId="DefaultParagraphFont">
     <w:name w:val="Default Paragraph Font"/>
     <w:uiPriority w:val="1"/>
+    <w:semiHidden/>
     <w:unhideWhenUsed/>
   </w:style>
-  <w:style w:type="table" w:styleId="TableNormal" w:default="1">
+  <w:style w:type="table" w:default="1" w:styleId="TableNormal">
     <w:name w:val="Normal Table"/>
     <w:uiPriority w:val="99"/>
     <w:semiHidden/>
@@ -2407,7 +2234,7 @@
       </w:tblCellMar>
     </w:tblPr>
   </w:style>
-  <w:style w:type="numbering" w:styleId="NoList" w:default="1">
+  <w:style w:type="numbering" w:default="1" w:styleId="NoList">
     <w:name w:val="No List"/>
     <w:uiPriority w:val="99"/>
     <w:semiHidden/>
@@ -2852,199 +2679,4 @@
   </a:objectDefaults>
   <a:extraClrSchemeLst/>
 </a:theme>
-</file>
-
-<file path=customXml/item1.xml><?xml version="1.0" encoding="utf-8"?>
-<ct:contentTypeSchema xmlns:ct="http://schemas.microsoft.com/office/2006/metadata/contentType" xmlns:ma="http://schemas.microsoft.com/office/2006/metadata/properties/metaAttributes" ct:_="" ma:_="" ma:contentTypeName="Document" ma:contentTypeID="0x01010040BB879F09736A449E488820A9264BB0" ma:contentTypeVersion="8" ma:contentTypeDescription="Create a new document." ma:contentTypeScope="" ma:versionID="cb82a9793dc4a9e32b168eb99560991b">
-  <xsd:schema xmlns:xsd="http://www.w3.org/2001/XMLSchema" xmlns:xs="http://www.w3.org/2001/XMLSchema" xmlns:p="http://schemas.microsoft.com/office/2006/metadata/properties" xmlns:ns2="6ab4b65a-cba2-4d6c-91cb-48344ac4be18" targetNamespace="http://schemas.microsoft.com/office/2006/metadata/properties" ma:root="true" ma:fieldsID="840c63a941ee35f6756f214d78d1bfa5" ns2:_="">
-    <xsd:import namespace="6ab4b65a-cba2-4d6c-91cb-48344ac4be18"/>
-    <xsd:element name="properties">
-      <xsd:complexType>
-        <xsd:sequence>
-          <xsd:element name="documentManagement">
-            <xsd:complexType>
-              <xsd:all>
-                <xsd:element ref="ns2:MediaServiceMetadata" minOccurs="0"/>
-                <xsd:element ref="ns2:MediaServiceFastMetadata" minOccurs="0"/>
-                <xsd:element ref="ns2:MediaServiceSearchProperties" minOccurs="0"/>
-                <xsd:element ref="ns2:MediaServiceDateTaken" minOccurs="0"/>
-                <xsd:element ref="ns2:lcf76f155ced4ddcb4097134ff3c332f" minOccurs="0"/>
-                <xsd:element ref="ns2:MediaServiceGenerationTime" minOccurs="0"/>
-                <xsd:element ref="ns2:MediaServiceEventHashCode" minOccurs="0"/>
-              </xsd:all>
-            </xsd:complexType>
-          </xsd:element>
-        </xsd:sequence>
-      </xsd:complexType>
-    </xsd:element>
-  </xsd:schema>
-  <xsd:schema xmlns:xsd="http://www.w3.org/2001/XMLSchema" xmlns:xs="http://www.w3.org/2001/XMLSchema" xmlns:dms="http://schemas.microsoft.com/office/2006/documentManagement/types" xmlns:pc="http://schemas.microsoft.com/office/infopath/2007/PartnerControls" targetNamespace="6ab4b65a-cba2-4d6c-91cb-48344ac4be18" elementFormDefault="qualified">
-    <xsd:import namespace="http://schemas.microsoft.com/office/2006/documentManagement/types"/>
-    <xsd:import namespace="http://schemas.microsoft.com/office/infopath/2007/PartnerControls"/>
-    <xsd:element name="MediaServiceMetadata" ma:index="8" nillable="true" ma:displayName="MediaServiceMetadata" ma:hidden="true" ma:internalName="MediaServiceMetadata" ma:readOnly="true">
-      <xsd:simpleType>
-        <xsd:restriction base="dms:Note"/>
-      </xsd:simpleType>
-    </xsd:element>
-    <xsd:element name="MediaServiceFastMetadata" ma:index="9" nillable="true" ma:displayName="MediaServiceFastMetadata" ma:hidden="true" ma:internalName="MediaServiceFastMetadata" ma:readOnly="true">
-      <xsd:simpleType>
-        <xsd:restriction base="dms:Note"/>
-      </xsd:simpleType>
-    </xsd:element>
-    <xsd:element name="MediaServiceSearchProperties" ma:index="10" nillable="true" ma:displayName="MediaServiceSearchProperties" ma:hidden="true" ma:internalName="MediaServiceSearchProperties" ma:readOnly="true">
-      <xsd:simpleType>
-        <xsd:restriction base="dms:Note"/>
-      </xsd:simpleType>
-    </xsd:element>
-    <xsd:element name="MediaServiceDateTaken" ma:index="11" nillable="true" ma:displayName="MediaServiceDateTaken" ma:hidden="true" ma:indexed="true" ma:internalName="MediaServiceDateTaken" ma:readOnly="true">
-      <xsd:simpleType>
-        <xsd:restriction base="dms:Text"/>
-      </xsd:simpleType>
-    </xsd:element>
-    <xsd:element name="lcf76f155ced4ddcb4097134ff3c332f" ma:index="13" nillable="true" ma:taxonomy="true" ma:internalName="lcf76f155ced4ddcb4097134ff3c332f" ma:taxonomyFieldName="MediaServiceImageTags" ma:displayName="Image Tags" ma:readOnly="false" ma:fieldId="{5cf76f15-5ced-4ddc-b409-7134ff3c332f}" ma:taxonomyMulti="true" ma:sspId="40543994-a631-47b9-8c03-29b83a6ff6bf" ma:termSetId="09814cd3-568e-fe90-9814-8d621ff8fb84" ma:anchorId="fba54fb3-c3e1-fe81-a776-ca4b69148c4d" ma:open="true" ma:isKeyword="false">
-      <xsd:complexType>
-        <xsd:sequence>
-          <xsd:element ref="pc:Terms" minOccurs="0" maxOccurs="1"/>
-        </xsd:sequence>
-      </xsd:complexType>
-    </xsd:element>
-    <xsd:element name="MediaServiceGenerationTime" ma:index="14" nillable="true" ma:displayName="MediaServiceGenerationTime" ma:hidden="true" ma:internalName="MediaServiceGenerationTime" ma:readOnly="true">
-      <xsd:simpleType>
-        <xsd:restriction base="dms:Text"/>
-      </xsd:simpleType>
-    </xsd:element>
-    <xsd:element name="MediaServiceEventHashCode" ma:index="15" nillable="true" ma:displayName="MediaServiceEventHashCode" ma:hidden="true" ma:internalName="MediaServiceEventHashCode" ma:readOnly="true">
-      <xsd:simpleType>
-        <xsd:restriction base="dms:Text"/>
-      </xsd:simpleType>
-    </xsd:element>
-  </xsd:schema>
-  <xsd:schema xmlns="http://schemas.openxmlformats.org/package/2006/metadata/core-properties" xmlns:xsd="http://www.w3.org/2001/XMLSchema" xmlns:xsi="http://www.w3.org/2001/XMLSchema-instance" xmlns:dc="http://purl.org/dc/elements/1.1/" xmlns:dcterms="http://purl.org/dc/terms/" xmlns:odoc="http://schemas.microsoft.com/internal/obd" targetNamespace="http://schemas.openxmlformats.org/package/2006/metadata/core-properties" elementFormDefault="qualified" attributeFormDefault="unqualified" blockDefault="#all">
-    <xsd:import namespace="http://purl.org/dc/elements/1.1/" schemaLocation="http://dublincore.org/schemas/xmls/qdc/2003/04/02/dc.xsd"/>
-    <xsd:import namespace="http://purl.org/dc/terms/" schemaLocation="http://dublincore.org/schemas/xmls/qdc/2003/04/02/dcterms.xsd"/>
-    <xsd:element name="coreProperties" type="CT_coreProperties"/>
-    <xsd:complexType name="CT_coreProperties">
-      <xsd:all>
-        <xsd:element ref="dc:creator" minOccurs="0" maxOccurs="1"/>
-        <xsd:element ref="dcterms:created" minOccurs="0" maxOccurs="1"/>
-        <xsd:element ref="dc:identifier" minOccurs="0" maxOccurs="1"/>
-        <xsd:element name="contentType" minOccurs="0" maxOccurs="1" type="xsd:string" ma:index="0" ma:displayName="Content Type"/>
-        <xsd:element ref="dc:title" minOccurs="0" maxOccurs="1" ma:index="4" ma:displayName="Title"/>
-        <xsd:element ref="dc:subject" minOccurs="0" maxOccurs="1"/>
-        <xsd:element ref="dc:description" minOccurs="0" maxOccurs="1"/>
-        <xsd:element name="keywords" minOccurs="0" maxOccurs="1" type="xsd:string"/>
-        <xsd:element ref="dc:language" minOccurs="0" maxOccurs="1"/>
-        <xsd:element name="category" minOccurs="0" maxOccurs="1" type="xsd:string"/>
-        <xsd:element name="version" minOccurs="0" maxOccurs="1" type="xsd:string"/>
-        <xsd:element name="revision" minOccurs="0" maxOccurs="1" type="xsd:string">
-          <xsd:annotation>
-            <xsd:documentation>
-                        This value indicates the number of saves or revisions. The application is responsible for updating this value after each revision.
-                    </xsd:documentation>
-          </xsd:annotation>
-        </xsd:element>
-        <xsd:element name="lastModifiedBy" minOccurs="0" maxOccurs="1" type="xsd:string"/>
-        <xsd:element ref="dcterms:modified" minOccurs="0" maxOccurs="1"/>
-        <xsd:element name="contentStatus" minOccurs="0" maxOccurs="1" type="xsd:string"/>
-      </xsd:all>
-    </xsd:complexType>
-  </xsd:schema>
-  <xs:schema xmlns:pc="http://schemas.microsoft.com/office/infopath/2007/PartnerControls" xmlns:xs="http://www.w3.org/2001/XMLSchema" targetNamespace="http://schemas.microsoft.com/office/infopath/2007/PartnerControls" elementFormDefault="qualified" attributeFormDefault="unqualified">
-    <xs:element name="Person">
-      <xs:complexType>
-        <xs:sequence>
-          <xs:element ref="pc:DisplayName" minOccurs="0"/>
-          <xs:element ref="pc:AccountId" minOccurs="0"/>
-          <xs:element ref="pc:AccountType" minOccurs="0"/>
-        </xs:sequence>
-      </xs:complexType>
-    </xs:element>
-    <xs:element name="DisplayName" type="xs:string"/>
-    <xs:element name="AccountId" type="xs:string"/>
-    <xs:element name="AccountType" type="xs:string"/>
-    <xs:element name="BDCAssociatedEntity">
-      <xs:complexType>
-        <xs:sequence>
-          <xs:element ref="pc:BDCEntity" minOccurs="0" maxOccurs="unbounded"/>
-        </xs:sequence>
-        <xs:attribute ref="pc:EntityNamespace"/>
-        <xs:attribute ref="pc:EntityName"/>
-        <xs:attribute ref="pc:SystemInstanceName"/>
-        <xs:attribute ref="pc:AssociationName"/>
-      </xs:complexType>
-    </xs:element>
-    <xs:attribute name="EntityNamespace" type="xs:string"/>
-    <xs:attribute name="EntityName" type="xs:string"/>
-    <xs:attribute name="SystemInstanceName" type="xs:string"/>
-    <xs:attribute name="AssociationName" type="xs:string"/>
-    <xs:element name="BDCEntity">
-      <xs:complexType>
-        <xs:sequence>
-          <xs:element ref="pc:EntityDisplayName" minOccurs="0"/>
-          <xs:element ref="pc:EntityInstanceReference" minOccurs="0"/>
-          <xs:element ref="pc:EntityId1" minOccurs="0"/>
-          <xs:element ref="pc:EntityId2" minOccurs="0"/>
-          <xs:element ref="pc:EntityId3" minOccurs="0"/>
-          <xs:element ref="pc:EntityId4" minOccurs="0"/>
-          <xs:element ref="pc:EntityId5" minOccurs="0"/>
-        </xs:sequence>
-      </xs:complexType>
-    </xs:element>
-    <xs:element name="EntityDisplayName" type="xs:string"/>
-    <xs:element name="EntityInstanceReference" type="xs:string"/>
-    <xs:element name="EntityId1" type="xs:string"/>
-    <xs:element name="EntityId2" type="xs:string"/>
-    <xs:element name="EntityId3" type="xs:string"/>
-    <xs:element name="EntityId4" type="xs:string"/>
-    <xs:element name="EntityId5" type="xs:string"/>
-    <xs:element name="Terms">
-      <xs:complexType>
-        <xs:sequence>
-          <xs:element ref="pc:TermInfo" minOccurs="0" maxOccurs="unbounded"/>
-        </xs:sequence>
-      </xs:complexType>
-    </xs:element>
-    <xs:element name="TermInfo">
-      <xs:complexType>
-        <xs:sequence>
-          <xs:element ref="pc:TermName" minOccurs="0"/>
-          <xs:element ref="pc:TermId" minOccurs="0"/>
-        </xs:sequence>
-      </xs:complexType>
-    </xs:element>
-    <xs:element name="TermName" type="xs:string"/>
-    <xs:element name="TermId" type="xs:string"/>
-  </xs:schema>
-</ct:contentTypeSchema>
-</file>
-
-<file path=customXml/item2.xml><?xml version="1.0" encoding="utf-8"?>
-<?mso-contentType ?>
-<FormTemplates xmlns="http://schemas.microsoft.com/sharepoint/v3/contenttype/forms">
-  <Display>DocumentLibraryForm</Display>
-  <Edit>DocumentLibraryForm</Edit>
-  <New>DocumentLibraryForm</New>
-</FormTemplates>
-</file>
-
-<file path=customXml/item3.xml><?xml version="1.0" encoding="utf-8"?>
-<p:properties xmlns:p="http://schemas.microsoft.com/office/2006/metadata/properties" xmlns:xsi="http://www.w3.org/2001/XMLSchema-instance" xmlns:pc="http://schemas.microsoft.com/office/infopath/2007/PartnerControls">
-  <documentManagement>
-    <lcf76f155ced4ddcb4097134ff3c332f xmlns="6ab4b65a-cba2-4d6c-91cb-48344ac4be18">
-      <Terms xmlns="http://schemas.microsoft.com/office/infopath/2007/PartnerControls"/>
-    </lcf76f155ced4ddcb4097134ff3c332f>
-  </documentManagement>
-</p:properties>
-</file>
-
-<file path=customXml/itemProps1.xml><?xml version="1.0" encoding="utf-8"?>
-<ds:datastoreItem xmlns:ds="http://schemas.openxmlformats.org/officeDocument/2006/customXml" ds:itemID="{6F91406D-8616-4163-B385-05207BF6C854}"/>
-</file>
-
-<file path=customXml/itemProps2.xml><?xml version="1.0" encoding="utf-8"?>
-<ds:datastoreItem xmlns:ds="http://schemas.openxmlformats.org/officeDocument/2006/customXml" ds:itemID="{3E279EB3-4DF4-41F3-B198-C6C12CDE9A53}"/>
-</file>
-
-<file path=customXml/itemProps3.xml><?xml version="1.0" encoding="utf-8"?>
-<ds:datastoreItem xmlns:ds="http://schemas.openxmlformats.org/officeDocument/2006/customXml" ds:itemID="{8719E69A-8159-4349-8E27-10F5E4AD170E}"/>
 </file>
</xml_diff>